<commit_message>
feat(lab4): add link to github repo in report
</commit_message>
<xml_diff>
--- a/lab4/report/lab4.docx
+++ b/lab4/report/lab4.docx
@@ -1569,6 +1569,7 @@
         <w:rPr>
           <w:sz w:val="28"/>
           <w:szCs w:val="28"/>
+          <w:lang w:val="en-US"/>
         </w:rPr>
       </w:pPr>
       <w:r>
@@ -4759,6 +4760,68 @@
       <w:pPr>
         <w:pStyle w:val="ListParagraph"/>
         <w:spacing w:line="360" w:lineRule="auto"/>
+        <w:ind w:left="0" w:firstLine="709"/>
+        <w:rPr>
+          <w:color w:val="000000"/>
+          <w:sz w:val="28"/>
+          <w:szCs w:val="28"/>
+          <w:lang w:val="uk-UA"/>
+        </w:rPr>
+      </w:pPr>
+      <w:r>
+        <w:rPr>
+          <w:color w:val="000000"/>
+          <w:sz w:val="28"/>
+          <w:szCs w:val="28"/>
+          <w:lang w:val="uk-UA"/>
+        </w:rPr>
+        <w:t xml:space="preserve">Код можна знайти в </w:t>
+      </w:r>
+      <w:proofErr w:type="spellStart"/>
+      <w:r>
+        <w:rPr>
+          <w:color w:val="000000"/>
+          <w:sz w:val="28"/>
+          <w:szCs w:val="28"/>
+          <w:lang w:val="uk-UA"/>
+        </w:rPr>
+        <w:t>репозиторії</w:t>
+      </w:r>
+      <w:proofErr w:type="spellEnd"/>
+      <w:r>
+        <w:rPr>
+          <w:color w:val="000000"/>
+          <w:sz w:val="28"/>
+          <w:szCs w:val="28"/>
+          <w:lang w:val="uk-UA"/>
+        </w:rPr>
+        <w:t>:</w:t>
+      </w:r>
+      <w:r>
+        <w:rPr>
+          <w:color w:val="000000"/>
+          <w:sz w:val="28"/>
+          <w:szCs w:val="28"/>
+          <w:lang w:val="en-US"/>
+        </w:rPr>
+        <w:t xml:space="preserve"> </w:t>
+      </w:r>
+      <w:hyperlink r:id="rId8" w:history="1">
+        <w:r>
+          <w:rPr>
+            <w:rStyle w:val="Hyperlink"/>
+            <w:sz w:val="28"/>
+            <w:szCs w:val="28"/>
+            <w:lang w:val="uk-UA"/>
+          </w:rPr>
+          <w:t>https://github.com/sokolovgit/software_components_engineering/tree/dev/lab4/apps</w:t>
+        </w:r>
+      </w:hyperlink>
+    </w:p>
+    <w:p>
+      <w:pPr>
+        <w:pStyle w:val="ListParagraph"/>
+        <w:spacing w:line="360" w:lineRule="auto"/>
         <w:ind w:left="1080"/>
         <w:rPr>
           <w:color w:val="000000"/>
@@ -4767,44 +4830,6 @@
           <w:lang w:val="uk-UA"/>
         </w:rPr>
       </w:pPr>
-      <w:r>
-        <w:rPr>
-          <w:color w:val="000000"/>
-          <w:sz w:val="28"/>
-          <w:szCs w:val="28"/>
-          <w:lang w:val="uk-UA"/>
-        </w:rPr>
-        <w:t xml:space="preserve">Код можна знайти в </w:t>
-      </w:r>
-      <w:proofErr w:type="spellStart"/>
-      <w:r>
-        <w:rPr>
-          <w:color w:val="000000"/>
-          <w:sz w:val="28"/>
-          <w:szCs w:val="28"/>
-          <w:lang w:val="uk-UA"/>
-        </w:rPr>
-        <w:t>репозиторії</w:t>
-      </w:r>
-      <w:proofErr w:type="spellEnd"/>
-      <w:r>
-        <w:rPr>
-          <w:color w:val="000000"/>
-          <w:sz w:val="28"/>
-          <w:szCs w:val="28"/>
-          <w:lang w:val="uk-UA"/>
-        </w:rPr>
-        <w:t>:</w:t>
-      </w:r>
-      <w:r>
-        <w:rPr>
-          <w:color w:val="000000"/>
-          <w:sz w:val="28"/>
-          <w:szCs w:val="28"/>
-          <w:lang w:val="uk-UA"/>
-        </w:rPr>
-        <w:t xml:space="preserve"> </w:t>
-      </w:r>
     </w:p>
     <w:p>
       <w:pPr>
@@ -4834,113 +4859,6 @@
             <wp:extent cx="5731510" cy="4417060"/>
             <wp:effectExtent l="0" t="0" r="0" b="2540"/>
             <wp:docPr id="1" name="Picture 1"/>
-            <wp:cNvGraphicFramePr>
-              <a:graphicFrameLocks xmlns:a="http://schemas.openxmlformats.org/drawingml/2006/main" noChangeAspect="1"/>
-            </wp:cNvGraphicFramePr>
-            <a:graphic xmlns:a="http://schemas.openxmlformats.org/drawingml/2006/main">
-              <a:graphicData uri="http://schemas.openxmlformats.org/drawingml/2006/picture">
-                <pic:pic xmlns:pic="http://schemas.openxmlformats.org/drawingml/2006/picture">
-                  <pic:nvPicPr>
-                    <pic:cNvPr id="1" name=""/>
-                    <pic:cNvPicPr/>
-                  </pic:nvPicPr>
-                  <pic:blipFill>
-                    <a:blip r:embed="rId8"/>
-                    <a:stretch>
-                      <a:fillRect/>
-                    </a:stretch>
-                  </pic:blipFill>
-                  <pic:spPr>
-                    <a:xfrm>
-                      <a:off x="0" y="0"/>
-                      <a:ext cx="5731510" cy="4417060"/>
-                    </a:xfrm>
-                    <a:prstGeom prst="rect">
-                      <a:avLst/>
-                    </a:prstGeom>
-                  </pic:spPr>
-                </pic:pic>
-              </a:graphicData>
-            </a:graphic>
-          </wp:inline>
-        </w:drawing>
-      </w:r>
-    </w:p>
-    <w:p>
-      <w:pPr>
-        <w:pStyle w:val="ListParagraph"/>
-        <w:spacing w:line="360" w:lineRule="auto"/>
-        <w:jc w:val="center"/>
-        <w:rPr>
-          <w:color w:val="000000"/>
-          <w:sz w:val="28"/>
-          <w:szCs w:val="28"/>
-          <w:lang w:val="en-US"/>
-        </w:rPr>
-      </w:pPr>
-      <w:r>
-        <w:rPr>
-          <w:color w:val="000000"/>
-          <w:sz w:val="28"/>
-          <w:szCs w:val="28"/>
-          <w:lang w:val="uk-UA"/>
-        </w:rPr>
-        <w:t xml:space="preserve">Рис. 1 – </w:t>
-      </w:r>
-      <w:r>
-        <w:rPr>
-          <w:color w:val="000000"/>
-          <w:sz w:val="28"/>
-          <w:szCs w:val="28"/>
-          <w:lang w:val="en-US"/>
-        </w:rPr>
-        <w:t>Streaming Service</w:t>
-      </w:r>
-    </w:p>
-    <w:p>
-      <w:pPr>
-        <w:pStyle w:val="ListParagraph"/>
-        <w:spacing w:line="360" w:lineRule="auto"/>
-        <w:jc w:val="center"/>
-        <w:rPr>
-          <w:b/>
-          <w:bCs/>
-          <w:color w:val="000000"/>
-          <w:sz w:val="28"/>
-          <w:szCs w:val="28"/>
-          <w:lang w:val="uk-UA"/>
-        </w:rPr>
-      </w:pPr>
-    </w:p>
-    <w:p>
-      <w:pPr>
-        <w:pStyle w:val="ListParagraph"/>
-        <w:spacing w:line="360" w:lineRule="auto"/>
-        <w:ind w:left="420"/>
-        <w:rPr>
-          <w:b/>
-          <w:bCs/>
-          <w:color w:val="000000"/>
-          <w:sz w:val="28"/>
-          <w:szCs w:val="28"/>
-          <w:lang w:val="uk-UA"/>
-        </w:rPr>
-      </w:pPr>
-      <w:r>
-        <w:rPr>
-          <w:b/>
-          <w:bCs/>
-          <w:color w:val="000000"/>
-          <w:sz w:val="28"/>
-          <w:szCs w:val="28"/>
-          <w:lang w:val="uk-UA"/>
-        </w:rPr>
-        <w:lastRenderedPageBreak/>
-        <w:drawing>
-          <wp:inline distT="0" distB="0" distL="0" distR="0" wp14:anchorId="2B61A12B" wp14:editId="08BB27A9">
-            <wp:extent cx="5731510" cy="4417060"/>
-            <wp:effectExtent l="0" t="0" r="0" b="2540"/>
-            <wp:docPr id="40" name="Picture 40"/>
             <wp:cNvGraphicFramePr>
               <a:graphicFrameLocks xmlns:a="http://schemas.openxmlformats.org/drawingml/2006/main" noChangeAspect="1"/>
             </wp:cNvGraphicFramePr>
@@ -4992,7 +4910,7 @@
           <w:szCs w:val="28"/>
           <w:lang w:val="uk-UA"/>
         </w:rPr>
-        <w:t xml:space="preserve">Рис. </w:t>
+        <w:t xml:space="preserve">Рис. 1 – </w:t>
       </w:r>
       <w:r>
         <w:rPr>
@@ -5001,40 +4919,28 @@
           <w:szCs w:val="28"/>
           <w:lang w:val="en-US"/>
         </w:rPr>
-        <w:t>2</w:t>
-      </w:r>
-      <w:r>
-        <w:rPr>
-          <w:color w:val="000000"/>
-          <w:sz w:val="28"/>
-          <w:szCs w:val="28"/>
-          <w:lang w:val="uk-UA"/>
-        </w:rPr>
-        <w:t xml:space="preserve"> – </w:t>
-      </w:r>
-      <w:r>
-        <w:rPr>
-          <w:color w:val="000000"/>
-          <w:sz w:val="28"/>
-          <w:szCs w:val="28"/>
-          <w:lang w:val="uk-UA"/>
-        </w:rPr>
-        <w:t xml:space="preserve">Візуалізація </w:t>
-      </w:r>
-      <w:r>
-        <w:rPr>
-          <w:color w:val="000000"/>
-          <w:sz w:val="28"/>
-          <w:szCs w:val="28"/>
-          <w:lang w:val="en-US"/>
-        </w:rPr>
-        <w:t>Kafka</w:t>
+        <w:t>Streaming Service</w:t>
       </w:r>
     </w:p>
     <w:p>
       <w:pPr>
         <w:pStyle w:val="ListParagraph"/>
         <w:spacing w:line="360" w:lineRule="auto"/>
+        <w:jc w:val="center"/>
+        <w:rPr>
+          <w:b/>
+          <w:bCs/>
+          <w:color w:val="000000"/>
+          <w:sz w:val="28"/>
+          <w:szCs w:val="28"/>
+          <w:lang w:val="uk-UA"/>
+        </w:rPr>
+      </w:pPr>
+    </w:p>
+    <w:p>
+      <w:pPr>
+        <w:pStyle w:val="ListParagraph"/>
+        <w:spacing w:line="360" w:lineRule="auto"/>
         <w:ind w:left="420"/>
         <w:rPr>
           <w:b/>
@@ -5045,35 +4951,21 @@
           <w:lang w:val="uk-UA"/>
         </w:rPr>
       </w:pPr>
-    </w:p>
-    <w:p>
-      <w:pPr>
-        <w:pStyle w:val="ListParagraph"/>
-        <w:spacing w:line="360" w:lineRule="auto"/>
-        <w:ind w:left="420"/>
-        <w:rPr>
-          <w:b/>
-          <w:bCs/>
-          <w:color w:val="000000"/>
-          <w:sz w:val="28"/>
-          <w:szCs w:val="28"/>
-          <w:lang w:val="uk-UA"/>
-        </w:rPr>
-      </w:pPr>
-      <w:r>
-        <w:rPr>
-          <w:b/>
-          <w:bCs/>
-          <w:color w:val="000000"/>
-          <w:sz w:val="28"/>
-          <w:szCs w:val="28"/>
-          <w:lang w:val="uk-UA"/>
-        </w:rPr>
+      <w:r>
+        <w:rPr>
+          <w:b/>
+          <w:bCs/>
+          <w:color w:val="000000"/>
+          <w:sz w:val="28"/>
+          <w:szCs w:val="28"/>
+          <w:lang w:val="uk-UA"/>
+        </w:rPr>
+        <w:lastRenderedPageBreak/>
         <w:drawing>
-          <wp:inline distT="0" distB="0" distL="0" distR="0" wp14:anchorId="2CA34305" wp14:editId="70694DAA">
-            <wp:extent cx="5731510" cy="3085465"/>
-            <wp:effectExtent l="0" t="0" r="0" b="635"/>
-            <wp:docPr id="41" name="Picture 41"/>
+          <wp:inline distT="0" distB="0" distL="0" distR="0" wp14:anchorId="2B61A12B" wp14:editId="08BB27A9">
+            <wp:extent cx="5731510" cy="4417060"/>
+            <wp:effectExtent l="0" t="0" r="0" b="2540"/>
+            <wp:docPr id="40" name="Picture 40"/>
             <wp:cNvGraphicFramePr>
               <a:graphicFrameLocks xmlns:a="http://schemas.openxmlformats.org/drawingml/2006/main" noChangeAspect="1"/>
             </wp:cNvGraphicFramePr>
@@ -5093,6 +4985,139 @@
                   <pic:spPr>
                     <a:xfrm>
                       <a:off x="0" y="0"/>
+                      <a:ext cx="5731510" cy="4417060"/>
+                    </a:xfrm>
+                    <a:prstGeom prst="rect">
+                      <a:avLst/>
+                    </a:prstGeom>
+                  </pic:spPr>
+                </pic:pic>
+              </a:graphicData>
+            </a:graphic>
+          </wp:inline>
+        </w:drawing>
+      </w:r>
+    </w:p>
+    <w:p>
+      <w:pPr>
+        <w:pStyle w:val="ListParagraph"/>
+        <w:spacing w:line="360" w:lineRule="auto"/>
+        <w:jc w:val="center"/>
+        <w:rPr>
+          <w:color w:val="000000"/>
+          <w:sz w:val="28"/>
+          <w:szCs w:val="28"/>
+          <w:lang w:val="en-US"/>
+        </w:rPr>
+      </w:pPr>
+      <w:r>
+        <w:rPr>
+          <w:color w:val="000000"/>
+          <w:sz w:val="28"/>
+          <w:szCs w:val="28"/>
+          <w:lang w:val="uk-UA"/>
+        </w:rPr>
+        <w:t xml:space="preserve">Рис. </w:t>
+      </w:r>
+      <w:r>
+        <w:rPr>
+          <w:color w:val="000000"/>
+          <w:sz w:val="28"/>
+          <w:szCs w:val="28"/>
+          <w:lang w:val="en-US"/>
+        </w:rPr>
+        <w:t>2</w:t>
+      </w:r>
+      <w:r>
+        <w:rPr>
+          <w:color w:val="000000"/>
+          <w:sz w:val="28"/>
+          <w:szCs w:val="28"/>
+          <w:lang w:val="uk-UA"/>
+        </w:rPr>
+        <w:t xml:space="preserve"> – </w:t>
+      </w:r>
+      <w:r>
+        <w:rPr>
+          <w:color w:val="000000"/>
+          <w:sz w:val="28"/>
+          <w:szCs w:val="28"/>
+          <w:lang w:val="uk-UA"/>
+        </w:rPr>
+        <w:t xml:space="preserve">Візуалізація </w:t>
+      </w:r>
+      <w:r>
+        <w:rPr>
+          <w:color w:val="000000"/>
+          <w:sz w:val="28"/>
+          <w:szCs w:val="28"/>
+          <w:lang w:val="en-US"/>
+        </w:rPr>
+        <w:t>Kafka</w:t>
+      </w:r>
+    </w:p>
+    <w:p>
+      <w:pPr>
+        <w:pStyle w:val="ListParagraph"/>
+        <w:spacing w:line="360" w:lineRule="auto"/>
+        <w:ind w:left="420"/>
+        <w:rPr>
+          <w:b/>
+          <w:bCs/>
+          <w:color w:val="000000"/>
+          <w:sz w:val="28"/>
+          <w:szCs w:val="28"/>
+          <w:lang w:val="uk-UA"/>
+        </w:rPr>
+      </w:pPr>
+    </w:p>
+    <w:p>
+      <w:pPr>
+        <w:pStyle w:val="ListParagraph"/>
+        <w:spacing w:line="360" w:lineRule="auto"/>
+        <w:ind w:left="420"/>
+        <w:rPr>
+          <w:b/>
+          <w:bCs/>
+          <w:color w:val="000000"/>
+          <w:sz w:val="28"/>
+          <w:szCs w:val="28"/>
+          <w:lang w:val="uk-UA"/>
+        </w:rPr>
+      </w:pPr>
+      <w:r>
+        <w:rPr>
+          <w:b/>
+          <w:bCs/>
+          <w:color w:val="000000"/>
+          <w:sz w:val="28"/>
+          <w:szCs w:val="28"/>
+          <w:lang w:val="uk-UA"/>
+        </w:rPr>
+        <w:drawing>
+          <wp:inline distT="0" distB="0" distL="0" distR="0" wp14:anchorId="2CA34305" wp14:editId="70694DAA">
+            <wp:extent cx="5731510" cy="3085465"/>
+            <wp:effectExtent l="0" t="0" r="0" b="635"/>
+            <wp:docPr id="41" name="Picture 41"/>
+            <wp:cNvGraphicFramePr>
+              <a:graphicFrameLocks xmlns:a="http://schemas.openxmlformats.org/drawingml/2006/main" noChangeAspect="1"/>
+            </wp:cNvGraphicFramePr>
+            <a:graphic xmlns:a="http://schemas.openxmlformats.org/drawingml/2006/main">
+              <a:graphicData uri="http://schemas.openxmlformats.org/drawingml/2006/picture">
+                <pic:pic xmlns:pic="http://schemas.openxmlformats.org/drawingml/2006/picture">
+                  <pic:nvPicPr>
+                    <pic:cNvPr id="1" name=""/>
+                    <pic:cNvPicPr/>
+                  </pic:nvPicPr>
+                  <pic:blipFill>
+                    <a:blip r:embed="rId11"/>
+                    <a:stretch>
+                      <a:fillRect/>
+                    </a:stretch>
+                  </pic:blipFill>
+                  <pic:spPr>
+                    <a:xfrm>
+                      <a:off x="0" y="0"/>
                       <a:ext cx="5731510" cy="3085465"/>
                     </a:xfrm>
                     <a:prstGeom prst="rect">
@@ -5219,7 +5244,7 @@
                     <pic:cNvPicPr/>
                   </pic:nvPicPr>
                   <pic:blipFill>
-                    <a:blip r:embed="rId11"/>
+                    <a:blip r:embed="rId12"/>
                     <a:stretch>
                       <a:fillRect/>
                     </a:stretch>

</xml_diff>